<commit_message>
Word copies regenerated for every Semester 2+ guide and cram sheet (incl. Clin Med Pro)
Co-Authored-By: Claude Opus 5.5 (1M context) <noreply@anthropic.com>
</commit_message>
<xml_diff>
--- a/Clinical Medicine and Surgery I Exam 1/cms-derm-staging-chart.docx
+++ b/Clinical Medicine and Surgery I Exam 1/cms-derm-staging-chart.docx
@@ -274,7 +274,7 @@
                 <w:i w:val="0"/>
                 <w:sz w:val="18"/>
               </w:rPr>
-              <w:t xml:space="preserve">Localised area of </w:t>
+              <w:t xml:space="preserve">Localized area of </w:t>
             </w:r>
             <w:r>
               <w:rPr>
@@ -618,7 +618,7 @@
                 <w:i w:val="0"/>
                 <w:sz w:val="18"/>
               </w:rPr>
-              <w:t>non-blanchable deep red / purple discolouration</w:t>
+              <w:t>non-blanchable deep red / purple discoloration</w:t>
             </w:r>
             <w:r>
               <w:rPr>
@@ -956,7 +956,7 @@
                 <w:i w:val="0"/>
                 <w:sz w:val="18"/>
               </w:rPr>
-              <w:t xml:space="preserve">, intense pain, oedema. </w:t>
+              <w:t xml:space="preserve">, intense pain, edema. </w:t>
             </w:r>
             <w:r>
               <w:rPr>
@@ -1219,7 +1219,7 @@
                 <w:i w:val="0"/>
                 <w:sz w:val="18"/>
               </w:rPr>
-              <w:t xml:space="preserve"> body surface area detachment, with mucosal erosions. Hospitalise; stop the drug.</w:t>
+              <w:t xml:space="preserve"> body surface area detachment, with mucosal erosions. Hospitalize; stop the drug.</w:t>
             </w:r>
           </w:p>
         </w:tc>
@@ -1406,7 +1406,7 @@
         <w:rPr>
           <w:sz w:val="15"/>
         </w:rPr>
-        <w:t>Mucosal erosions and haemorrhagic crusting of the lips — present across the spectrum, so it does not tell you which end you are at. Slide 80.</w:t>
+        <w:t>Mucosal erosions and hemorrhagic crusting of the lips — present across the spectrum, so it does not tell you which end you are at. Slide 80.</w:t>
       </w:r>
     </w:p>
     <w:p>
@@ -2023,7 +2023,7 @@
           <w:b w:val="0"/>
           <w:i w:val="0"/>
         </w:rPr>
-        <w:t xml:space="preserve"> and guides photoprotection counselling. </w:t>
+        <w:t xml:space="preserve"> and guides photoprotection counseling. </w:t>
       </w:r>
       <w:r>
         <w:rPr>
@@ -2044,7 +2044,7 @@
           <w:b w:val="0"/>
           <w:i w:val="0"/>
         </w:rPr>
-        <w:t xml:space="preserve"> to ultraviolet light — burning and tanning history — not what colour it is.</w:t>
+        <w:t xml:space="preserve"> to ultraviolet light — burning and tanning history — not what color it is.</w:t>
       </w:r>
       <w:r>
         <w:rPr>
@@ -3015,7 +3015,7 @@
                 <w:i w:val="0"/>
                 <w:sz w:val="18"/>
               </w:rPr>
-              <w:t>Stage 1 — early localised</w:t>
+              <w:t>Stage 1 — early localized</w:t>
             </w:r>
           </w:p>
         </w:tc>
@@ -3062,7 +3062,7 @@
                 <w:i w:val="0"/>
                 <w:sz w:val="18"/>
               </w:rPr>
-              <w:t xml:space="preserve"> with central clearing and often a darker punctate centre at the bite. </w:t>
+              <w:t xml:space="preserve"> with central clearing and often a darker punctate center at the bite. </w:t>
             </w:r>
             <w:r>
               <w:rPr>
@@ -3849,7 +3849,7 @@
                 <w:i w:val="0"/>
                 <w:sz w:val="18"/>
               </w:rPr>
-              <w:t xml:space="preserve"> in the same patient — a generalised pruritic eruption “in multiple stages of healing”.</w:t>
+              <w:t xml:space="preserve"> in the same patient — a generalized pruritic eruption “in multiple stages of healing”.</w:t>
             </w:r>
           </w:p>
         </w:tc>
@@ -4362,7 +4362,7 @@
                 <w:i w:val="0"/>
                 <w:sz w:val="18"/>
               </w:rPr>
-              <w:t>tensile strength improves through progressive cross-linking of collagen fibres</w:t>
+              <w:t>tensile strength improves through progressive cross-linking of collagen fibers</w:t>
             </w:r>
             <w:r>
               <w:rPr>
@@ -4742,7 +4742,7 @@
         <w:rPr>
           <w:sz w:val="15"/>
         </w:rPr>
-        <w:t>The proliferative phase in one infant from 3 days to 5 months — the growth curve the parents are being counselled about. Slide 68.</w:t>
+        <w:t>The proliferative phase in one infant from 3 days to 5 months — the growth curve the parents are being counseled about. Slide 68.</w:t>
       </w:r>
     </w:p>
     <w:p>
@@ -4885,7 +4885,7 @@
                 <w:i w:val="0"/>
                 <w:sz w:val="18"/>
               </w:rPr>
-              <w:t>2. Stabilisation</w:t>
+              <w:t>2. Stabilization</w:t>
             </w:r>
           </w:p>
         </w:tc>
@@ -5141,7 +5141,7 @@
                 <w:i w:val="0"/>
                 <w:sz w:val="18"/>
               </w:rPr>
-              <w:t>Erythema, oedema, papules, vesicles, oozing and crusting.</w:t>
+              <w:t>Erythema, edema, papules, vesicles, oozing and crusting.</w:t>
             </w:r>
           </w:p>
         </w:tc>
@@ -6054,7 +6054,7 @@
         <w:rPr>
           <w:sz w:val="15"/>
         </w:rPr>
-        <w:t>The deck's labelled papule and pustule — the inflammatory lesions that move a patient off the comedonal rung. Slide 11.</w:t>
+        <w:t>The deck's labeled papule and pustule — the inflammatory lesions that move a patient off the comedonal rung. Slide 11.</w:t>
       </w:r>
     </w:p>
     <w:p>
@@ -6177,7 +6177,7 @@
           <w:b w:val="0"/>
           <w:i w:val="0"/>
         </w:rPr>
-        <w:t xml:space="preserve"> — but Clark levels still appear on pathology reports, so the ladder is worth recognising.</w:t>
+        <w:t xml:space="preserve"> — but Clark levels still appear on pathology reports, so the ladder is worth recognizing.</w:t>
       </w:r>
     </w:p>
     <w:tbl>
@@ -6915,7 +6915,7 @@
                 <w:i w:val="0"/>
                 <w:sz w:val="18"/>
               </w:rPr>
-              <w:t>Expert-centre referral</w:t>
+              <w:t>Expert-center referral</w:t>
             </w:r>
           </w:p>
         </w:tc>
@@ -7445,7 +7445,7 @@
           <w:b w:val="0"/>
           <w:i w:val="0"/>
         </w:rPr>
-        <w:t xml:space="preserve"> is primary tumour thickness, </w:t>
+        <w:t xml:space="preserve"> is primary tumor thickness, </w:t>
       </w:r>
       <w:r>
         <w:rPr>
@@ -7459,7 +7459,7 @@
           <w:b w:val="0"/>
           <w:i w:val="0"/>
         </w:rPr>
-        <w:t xml:space="preserve"> the number of tumour-involved regional lymph nodes, and </w:t>
+        <w:t xml:space="preserve"> the number of tumor-involved regional lymph nodes, and </w:t>
       </w:r>
       <w:r>
         <w:rPr>
@@ -7501,7 +7501,7 @@
           <w:b w:val="0"/>
           <w:i w:val="0"/>
         </w:rPr>
-        <w:t>. Anything M1 is stage IV regardless of the tumour.</w:t>
+        <w:t>. Anything M1 is stage IV regardless of the tumor.</w:t>
       </w:r>
     </w:p>
     <w:tbl>
@@ -8524,7 +8524,7 @@
         <w:rPr>
           <w:sz w:val="15"/>
         </w:rPr>
-        <w:t>Blood deposits — the pair separated by millimetres rather than by a centimetre. Slide 15.</w:t>
+        <w:t>Blood deposits — the pair separated by millimeters rather than by a centimeter. Slide 15.</w:t>
       </w:r>
     </w:p>
     <w:p>

</xml_diff>